<commit_message>
fix: remove Domicilio/Telefono from document preview, pass empty values to template
</commit_message>
<xml_diff>
--- a/src/templates/declaracion-conflicto.docx
+++ b/src/templates/declaracion-conflicto.docx
@@ -47,93 +47,23 @@
         <w:rPr>
           <w:lang w:val="es-MX"/>
         </w:rPr>
-        <w:t xml:space="preserve"> sus controladoras, subsidiarias y/o filiales, (en lo sucesivo de manera conjunta "Grupo </w:t>
-      </w:r>
-      <w:proofErr w:type="spellStart"/>
-      <w:r>
-        <w:rPr>
-          <w:lang w:val="es-MX"/>
-        </w:rPr>
-        <w:t>Another</w:t>
-      </w:r>
-      <w:proofErr w:type="spellEnd"/>
-      <w:r>
-        <w:rPr>
-          <w:lang w:val="es-MX"/>
-        </w:rPr>
-        <w:t xml:space="preserve">") hago de su conocimiento y declaro expresamente que no existe ningún tipo de conflicto de interés [en caso contrario deberá firmarse la carta Manifestación de conflicto de interés] entre la empresa que represento, sus respectivas filiales, subcontratistas accionistas, asociados, directores, ejecutivos, apoderados, asesores, representantes, consultores, empleados, y cualquier tercero que participe directamente en la prestación de los servicios o suministro de productos (en lo sucesivo de manera conjunta el "Personal del Proveedor"), así como terceros que directa o indirectamente se beneficien de las relaciones comerciales con Grupo </w:t>
-      </w:r>
-      <w:proofErr w:type="spellStart"/>
-      <w:r>
-        <w:rPr>
-          <w:lang w:val="es-MX"/>
-        </w:rPr>
-        <w:t>Another</w:t>
-      </w:r>
-      <w:proofErr w:type="spellEnd"/>
-      <w:r>
-        <w:rPr>
-          <w:lang w:val="es-MX"/>
-        </w:rPr>
-        <w:t xml:space="preserve">, tales como cónyuges y parientes consanguíneos o por afinidad del Personal del Proveedor con Grupo </w:t>
-      </w:r>
-      <w:proofErr w:type="spellStart"/>
-      <w:r>
-        <w:rPr>
-          <w:lang w:val="es-MX"/>
-        </w:rPr>
-        <w:t>Another</w:t>
-      </w:r>
-      <w:proofErr w:type="spellEnd"/>
-      <w:r>
-        <w:rPr>
-          <w:lang w:val="es-MX"/>
-        </w:rPr>
-        <w:t xml:space="preserve">, sus respectivas filiales, accionistas, asociados, directores, ejecutivos, apoderados y empleados de Grupo </w:t>
-      </w:r>
-      <w:proofErr w:type="spellStart"/>
-      <w:r>
-        <w:rPr>
-          <w:lang w:val="es-MX"/>
-        </w:rPr>
-        <w:t>Another</w:t>
-      </w:r>
-      <w:proofErr w:type="spellEnd"/>
-      <w:r>
-        <w:rPr>
-          <w:lang w:val="es-MX"/>
-        </w:rPr>
-        <w:t>. Entendiéndose por conflicto de interés aquellas situaciones en las que exista algún interés personal, familiar o de negocios, en las relaciones comerciales de las Partes firmantes del Contrato Marco de Prestación de Servicios y/o Suministro, y del que resulte o pueda resultar un lucro indebido en beneficio directo o indirecto de alguna de las partes o de su personal, en perjuicio de la otra parte.</w:t>
-      </w:r>
-    </w:p>
-    <w:p>
-      <w:pPr>
-        <w:spacing w:before="309"/>
-        <w:ind w:right="4"/>
-        <w:jc w:val="both"/>
-        <w:rPr>
-          <w:lang w:val="es-MX"/>
-        </w:rPr>
-      </w:pPr>
-      <w:r>
-        <w:rPr>
-          <w:lang w:val="es-MX"/>
-        </w:rPr>
-        <w:t xml:space="preserve">En caso de existir algún vínculo personal que pudiera estar relacionado con suministrar productos o prestar servicios al amparo del Contrato Marco de Prestación de Servicios y/o Suministro, me obligo a notificar tal circunstancia a Grupo </w:t>
-      </w:r>
-      <w:proofErr w:type="spellStart"/>
-      <w:r>
-        <w:rPr>
-          <w:lang w:val="es-MX"/>
-        </w:rPr>
-        <w:t>Another</w:t>
-      </w:r>
-      <w:proofErr w:type="spellEnd"/>
-      <w:r>
-        <w:rPr>
-          <w:lang w:val="es-MX"/>
-        </w:rPr>
-        <w:t xml:space="preserve"> y de este modo, gestionar apropiadamente esos conflictos existentes o potenciales.</w:t>
+        <w:t> sus controladoras, subsidiarias y/o filiales, (en lo sucesivo de manera conjunta "Grupo Another") hago de su conocimiento y declaro expresamente que no existe ningún tipo de conflicto de interés [en caso contrario deberá firmarse la carta Manifestación de conflicto de interés] entre la empresa que represento, sus respectivas filiales, subcontratistas accionistas, asociados, directores, ejecutivos, apoderados, asesores, representantes, consultores, empleados, y cualquier tercero que participe directamente en la prestación de los servicios o suministro de productos (en lo sucesivo de manera conjunta el "Personal del Proveedor"), así como terceros que directa o indirectamente se beneficien de las relaciones comerciales con Grupo Another, tales como cónyuges y parientes consanguíneos o por afinidad del Personal del Proveedor con Grupo Another, sus respectivas filiales, accionistas, asociados, directores, ejecutivos, apoderados y empleados de Grupo Another. Entendiéndose por conflicto de interés aquellas situaciones en las que exista algún interés personal, familiar o de negocios, en las relaciones comerciales de las Partes firmantes del Contrato Marco de Prestación de Servicios y/o Suministro, y del que resulte o pueda resultar un lucro indebido en beneficio directo o indirecto de alguna de las partes o de su personal, en perjuicio de la otra parte.</w:t>
+      </w:r>
+    </w:p>
+    <w:p>
+      <w:pPr>
+        <w:spacing w:before="309"/>
+        <w:ind w:right="4"/>
+        <w:jc w:val="both"/>
+        <w:rPr>
+          <w:lang w:val="es-MX"/>
+        </w:rPr>
+      </w:pPr>
+      <w:r>
+        <w:rPr>
+          <w:lang w:val="es-MX"/>
+        </w:rPr>
+        <w:t>En caso de existir algún vínculo personal que pudiera estar relacionado con suministrar productos o prestar servicios al amparo del Contrato Marco de Prestación de Servicios y/o Suministro, me obligo a notificar tal circunstancia a Grupo Another y de este modo, gestionar apropiadamente esos conflictos existentes o potenciales.</w:t>
       </w:r>
     </w:p>
     <w:p>
@@ -165,95 +95,39 @@
         <w:rPr>
           <w:lang w:val="es-MX"/>
         </w:rPr>
-        <w:t xml:space="preserve">El Proveedor reconoce y acepta que, sólo suministrará los Productos y/o prestará los Servicios especificados en la correspondiente Orden de Suministro u Orden de Servicio, y que tendrá estrictamente prohibido realizar actividades, entregar Productos o prestar Servicios distintos a los requeridos o no solicitados a través de la correspondiente Orden de Suministro u Orden de Servicio, de igual manera, no se tendrá como válido ningún acuerdo u ofrecimiento verbal realizado por funcionarios de Grupo </w:t>
-      </w:r>
-      <w:proofErr w:type="spellStart"/>
-      <w:r>
-        <w:rPr>
-          <w:lang w:val="es-MX"/>
-        </w:rPr>
-        <w:t>Another</w:t>
-      </w:r>
-      <w:proofErr w:type="spellEnd"/>
-      <w:r>
-        <w:rPr>
-          <w:lang w:val="es-MX"/>
-        </w:rPr>
-        <w:t xml:space="preserve">, en caso de que dichas circunstancias llegaran a suceder, Grupo </w:t>
-      </w:r>
-      <w:proofErr w:type="spellStart"/>
-      <w:r>
-        <w:rPr>
-          <w:lang w:val="es-MX"/>
-        </w:rPr>
-        <w:t>Another</w:t>
-      </w:r>
-      <w:proofErr w:type="spellEnd"/>
-      <w:r>
-        <w:rPr>
-          <w:lang w:val="es-MX"/>
-        </w:rPr>
-        <w:t xml:space="preserve"> no pagará al Proveedor por los Productos o Servicios prestados, ni asumirá el costo, directo o indirecto, que pudiera resultar de los mismos o en relación con estos.</w:t>
-      </w:r>
-    </w:p>
-    <w:p>
-      <w:pPr>
-        <w:spacing w:before="309"/>
-        <w:ind w:right="4"/>
-        <w:jc w:val="both"/>
-        <w:rPr>
-          <w:lang w:val="es-MX"/>
-        </w:rPr>
-      </w:pPr>
-      <w:r>
-        <w:rPr>
-          <w:lang w:val="es-MX"/>
-        </w:rPr>
-        <w:t xml:space="preserve">La inobservancia por parte del Proveedor a los términos aquí establecidos constituirá causa de terminación inmediata de cualquier tipo de acuerdo que en su caso haya sido formalizado con Grupo </w:t>
-      </w:r>
-      <w:proofErr w:type="spellStart"/>
-      <w:r>
-        <w:rPr>
-          <w:lang w:val="es-MX"/>
-        </w:rPr>
-        <w:t>Another</w:t>
-      </w:r>
-      <w:proofErr w:type="spellEnd"/>
-      <w:r>
-        <w:rPr>
-          <w:lang w:val="es-MX"/>
-        </w:rPr>
-        <w:t xml:space="preserve"> sin ninguna responsabilidad de su parte.</w:t>
-      </w:r>
-    </w:p>
-    <w:p>
-      <w:pPr>
-        <w:spacing w:before="309"/>
-        <w:ind w:right="4"/>
-        <w:jc w:val="both"/>
-        <w:rPr>
-          <w:lang w:val="es-MX"/>
-        </w:rPr>
-      </w:pPr>
-      <w:r>
-        <w:rPr>
-          <w:lang w:val="es-MX"/>
-        </w:rPr>
-        <w:t xml:space="preserve">Por lo anterior, en mi carácter de Proveedor de Grupo </w:t>
-      </w:r>
-      <w:proofErr w:type="spellStart"/>
-      <w:r>
-        <w:rPr>
-          <w:lang w:val="es-MX"/>
-        </w:rPr>
-        <w:t>Another</w:t>
-      </w:r>
-      <w:proofErr w:type="spellEnd"/>
-      <w:r>
-        <w:rPr>
-          <w:lang w:val="es-MX"/>
-        </w:rPr>
-        <w:t xml:space="preserve"> manifiesto bajo protesta de decir verdad, que toda la información proporcionada en el presente documento es verdadera.</w:t>
+        <w:t>El Proveedor reconoce y acepta que, sólo suministrará los Productos y/o prestará los Servicios especificados en la correspondiente Orden de Suministro u Orden de Servicio, y que tendrá estrictamente prohibido realizar actividades, entregar Productos o prestar Servicios distintos a los requeridos o no solicitados a través de la correspondiente Orden de Suministro u Orden de Servicio, de igual manera, no se tendrá como válido ningún acuerdo u ofrecimiento verbal realizado por funcionarios de Grupo Another, en caso de que dichas circunstancias llegaran a suceder, Grupo Another no pagará al Proveedor por los Productos o Servicios prestados, ni asumirá el costo, directo o indirecto, que pudiera resultar de los mismos o en relación con estos.</w:t>
+      </w:r>
+    </w:p>
+    <w:p>
+      <w:pPr>
+        <w:spacing w:before="309"/>
+        <w:ind w:right="4"/>
+        <w:jc w:val="both"/>
+        <w:rPr>
+          <w:lang w:val="es-MX"/>
+        </w:rPr>
+      </w:pPr>
+      <w:r>
+        <w:rPr>
+          <w:lang w:val="es-MX"/>
+        </w:rPr>
+        <w:t>La inobservancia por parte del Proveedor a los términos aquí establecidos constituirá causa de terminación inmediata de cualquier tipo de acuerdo que en su caso haya sido formalizado con Grupo Another sin ninguna responsabilidad de su parte.</w:t>
+      </w:r>
+    </w:p>
+    <w:p>
+      <w:pPr>
+        <w:spacing w:before="309"/>
+        <w:ind w:right="4"/>
+        <w:jc w:val="both"/>
+        <w:rPr>
+          <w:lang w:val="es-MX"/>
+        </w:rPr>
+      </w:pPr>
+      <w:r>
+        <w:rPr>
+          <w:lang w:val="es-MX"/>
+        </w:rPr>
+        <w:t>Por lo anterior, en mi carácter de Proveedor de Grupo Another manifiesto bajo protesta de decir verdad, que toda la información proporcionada en el presente documento es verdadera.</w:t>
       </w:r>
     </w:p>
     <w:p>
@@ -326,97 +200,23 @@
         <w:rPr>
           <w:lang w:val="es-MX"/>
         </w:rPr>
-        <w:t>Nombre del Proveedor o Razón Social: {</w:t>
-      </w:r>
-      <w:proofErr w:type="spellStart"/>
-      <w:r>
-        <w:rPr>
-          <w:lang w:val="es-MX"/>
-        </w:rPr>
-        <w:t>nombre_proveedor_razon_social</w:t>
-      </w:r>
-      <w:proofErr w:type="spellEnd"/>
-      <w:r>
-        <w:rPr>
-          <w:lang w:val="es-MX"/>
-        </w:rPr>
-        <w:t>}</w:t>
-      </w:r>
-    </w:p>
-    <w:p>
-      <w:pPr>
-        <w:spacing w:before="309"/>
-        <w:ind w:right="4"/>
-        <w:jc w:val="both"/>
-        <w:rPr>
-          <w:lang w:val="es-MX"/>
-        </w:rPr>
-      </w:pPr>
-      <w:r>
-        <w:rPr>
-          <w:lang w:val="es-MX"/>
-        </w:rPr>
-        <w:t>Nombre del Representante Legal: {</w:t>
-      </w:r>
-      <w:proofErr w:type="spellStart"/>
-      <w:r>
-        <w:rPr>
-          <w:lang w:val="es-MX"/>
-        </w:rPr>
-        <w:t>nombre_representante_legal</w:t>
-      </w:r>
-      <w:proofErr w:type="spellEnd"/>
-      <w:r>
-        <w:rPr>
-          <w:lang w:val="es-MX"/>
-        </w:rPr>
-        <w:t>}</w:t>
-      </w:r>
-    </w:p>
-    <w:p>
-      <w:pPr>
-        <w:spacing w:before="309"/>
-        <w:ind w:right="4"/>
-        <w:jc w:val="both"/>
-        <w:rPr>
-          <w:lang w:val="es-MX"/>
-        </w:rPr>
-      </w:pPr>
-      <w:r>
-        <w:rPr>
-          <w:lang w:val="es-MX"/>
-        </w:rPr>
-        <w:t>Domicilio: {domicilio}</w:t>
-      </w:r>
-    </w:p>
-    <w:p>
-      <w:pPr>
-        <w:spacing w:before="309"/>
-        <w:ind w:right="4"/>
-        <w:jc w:val="both"/>
-        <w:rPr>
-          <w:lang w:val="es-MX"/>
-        </w:rPr>
-      </w:pPr>
-      <w:r>
-        <w:rPr>
-          <w:lang w:val="es-MX"/>
-        </w:rPr>
-        <w:t>Teléfono: {</w:t>
-      </w:r>
-      <w:proofErr w:type="spellStart"/>
-      <w:r>
-        <w:rPr>
-          <w:lang w:val="es-MX"/>
-        </w:rPr>
-        <w:t>telefono</w:t>
-      </w:r>
-      <w:proofErr w:type="spellEnd"/>
-      <w:r>
-        <w:rPr>
-          <w:lang w:val="es-MX"/>
-        </w:rPr>
-        <w:t>}</w:t>
+        <w:t>Nombre del Proveedor o Razón Social: {nombre_proveedor_razon_social}</w:t>
+      </w:r>
+    </w:p>
+    <w:p>
+      <w:pPr>
+        <w:spacing w:before="309"/>
+        <w:ind w:right="4"/>
+        <w:jc w:val="both"/>
+        <w:rPr>
+          <w:lang w:val="es-MX"/>
+        </w:rPr>
+      </w:pPr>
+      <w:r>
+        <w:rPr>
+          <w:lang w:val="es-MX"/>
+        </w:rPr>
+        <w:t>Nombre del Representante Legal: {nombre_representante_legal}</w:t>
       </w:r>
     </w:p>
     <w:p>
@@ -448,51 +248,23 @@
         <w:rPr>
           <w:lang w:val="es-MX"/>
         </w:rPr>
-        <w:t>{%</w:t>
-      </w:r>
-      <w:proofErr w:type="spellStart"/>
-      <w:r>
-        <w:rPr>
-          <w:lang w:val="es-MX"/>
-        </w:rPr>
-        <w:t>firma_proveedor</w:t>
-      </w:r>
-      <w:proofErr w:type="spellEnd"/>
-      <w:r>
-        <w:rPr>
-          <w:lang w:val="es-MX"/>
-        </w:rPr>
-        <w:t>}</w:t>
-      </w:r>
-    </w:p>
-    <w:p>
-      <w:pPr>
-        <w:spacing w:before="309"/>
-        <w:ind w:right="4"/>
-        <w:jc w:val="both"/>
-        <w:rPr>
-          <w:lang w:val="es-MX"/>
-        </w:rPr>
-      </w:pPr>
-      <w:r>
-        <w:rPr>
-          <w:lang w:val="es-MX"/>
-        </w:rPr>
-        <w:t>Fecha: {</w:t>
-      </w:r>
-      <w:proofErr w:type="spellStart"/>
-      <w:r>
-        <w:rPr>
-          <w:lang w:val="es-MX"/>
-        </w:rPr>
-        <w:t>fecha_de_la_firma</w:t>
-      </w:r>
-      <w:proofErr w:type="spellEnd"/>
-      <w:r>
-        <w:rPr>
-          <w:lang w:val="es-MX"/>
-        </w:rPr>
-        <w:t>}</w:t>
+        <w:t>{%firma_proveedor}</w:t>
+      </w:r>
+    </w:p>
+    <w:p>
+      <w:pPr>
+        <w:spacing w:before="309"/>
+        <w:ind w:right="4"/>
+        <w:jc w:val="both"/>
+        <w:rPr>
+          <w:lang w:val="es-MX"/>
+        </w:rPr>
+      </w:pPr>
+      <w:r>
+        <w:rPr>
+          <w:lang w:val="es-MX"/>
+        </w:rPr>
+        <w:t>Fecha: {fecha_de_la_firma}</w:t>
       </w:r>
     </w:p>
     <w:p>
@@ -509,7 +281,7 @@
           <w:lang w:val="es-MX"/>
         </w:rPr>
         <w:pict w14:anchorId="184FC9D5">
-          <v:rect id="_x0000_i1037" style="width:0;height:1.5pt" o:hralign="center" o:hrstd="t" o:hr="t" fillcolor="#a0a0a0" stroked="f"/>
+          <v:rect id="_x0000_i1025" style="width:0;height:1.5pt" o:hralign="center" o:hrstd="t" o:hr="t" fillcolor="#a0a0a0" stroked="f"/>
         </w:pict>
       </w:r>
     </w:p>
@@ -1333,6 +1105,7 @@
   <w:style w:type="character" w:default="1" w:styleId="Fuentedeprrafopredeter">
     <w:name w:val="Default Paragraph Font"/>
     <w:uiPriority w:val="1"/>
+    <w:semiHidden/>
     <w:unhideWhenUsed/>
   </w:style>
   <w:style w:type="table" w:default="1" w:styleId="Tablanormal">

</xml_diff>